<commit_message>
update submission document and remove test file
</commit_message>
<xml_diff>
--- a/Shenteng_MA_20721362.docx
+++ b/Shenteng_MA_20721362.docx
@@ -67,18 +67,7 @@
         </w:rPr>
       </w:pPr>
       <w:r>
-        <w:rPr>
-          <w:b/>
-          <w:bCs/>
-        </w:rPr>
-        <w:t xml:space="preserve">Date of report: </w:t>
-      </w:r>
-      <w:r>
-        <w:rPr>
-          <w:b/>
-          <w:bCs/>
-        </w:rPr>
-        <w:t>Add submission date here</w:t>
+        <w:t>Date of report: 18 April 2026</w:t>
       </w:r>
     </w:p>
     <w:p>
@@ -499,7 +488,7 @@
           <w:noProof/>
         </w:rPr>
         <w:drawing>
-          <wp:inline distT="0" distB="0" distL="0" distR="0" wp14:anchorId="619C74F4" wp14:editId="677311C7">
+          <wp:inline distT="0" distB="0" distL="0" distR="0" wp14:anchorId="619C74F4" wp14:editId="753DDA82">
             <wp:extent cx="5731510" cy="3456305"/>
             <wp:effectExtent l="0" t="0" r="0" b="0"/>
             <wp:docPr id="924434136" name="图片 3" descr="图表&#10;&#10;AI 生成的内容可能不正确。"/>
@@ -562,17 +551,15 @@
     </w:p>
     <w:p>
       <w:r>
-        <w:t>T</w:t>
-      </w:r>
-      <w:r>
-        <w:t>ask 1 Log file Extract:</w:t>
-      </w:r>
-    </w:p>
-    <w:p>
-      <w:pPr>
-        <w:rPr>
-          <w:rFonts w:ascii="Consolas" w:eastAsia="Consolas" w:hAnsi="Consolas"/>
-          <w:sz w:val="18"/>
+        <w:t>Task 1 Log file Extract:</w:t>
+      </w:r>
+    </w:p>
+    <w:p>
+      <w:pPr>
+        <w:rPr>
+          <w:rFonts w:ascii="Consolas" w:eastAsia="Consolas" w:hAnsi="Consolas"/>
+          <w:sz w:val="18"/>
+          <w:lang w:val="en-US"/>
         </w:rPr>
       </w:pPr>
       <w:r>
@@ -812,6 +799,14 @@
           <w:sz w:val="18"/>
         </w:rPr>
         <w:t>deg</w:t>
+      </w:r>
+      <w:r>
+        <w:rPr>
+          <w:rFonts w:ascii="Consolas" w:eastAsia="Consolas" w:hAnsi="Consolas" w:hint="eastAsia"/>
+          <w:sz w:val="18"/>
+          <w:lang w:eastAsia="zh-CN"/>
+        </w:rPr>
+        <w:t>C</w:t>
       </w:r>
       <w:proofErr w:type="spellEnd"/>
     </w:p>
@@ -1911,7 +1906,7 @@
           <w:highlight w:val="cyan"/>
           <w:lang w:val="en-US" w:eastAsia="zh-CN"/>
         </w:rPr>
-        <w:t xml:space="preserve">Task </w:t>
+        <w:t xml:space="preserve">Task 3 – Temperature </w:t>
       </w:r>
       <w:r>
         <w:rPr>
@@ -1920,24 +1915,6 @@
           <w:highlight w:val="cyan"/>
           <w:lang w:val="en-US" w:eastAsia="zh-CN"/>
         </w:rPr>
-        <w:t>3</w:t>
-      </w:r>
-      <w:r>
-        <w:rPr>
-          <w:sz w:val="24"/>
-          <w:szCs w:val="24"/>
-          <w:highlight w:val="cyan"/>
-          <w:lang w:val="en-US" w:eastAsia="zh-CN"/>
-        </w:rPr>
-        <w:t xml:space="preserve"> – Temperature </w:t>
-      </w:r>
-      <w:r>
-        <w:rPr>
-          <w:sz w:val="24"/>
-          <w:szCs w:val="24"/>
-          <w:highlight w:val="cyan"/>
-          <w:lang w:val="en-US" w:eastAsia="zh-CN"/>
-        </w:rPr>
         <w:t>Prediction Algorithm</w:t>
       </w:r>
     </w:p>
@@ -1952,6 +1929,77 @@
       <w:proofErr w:type="spellEnd"/>
       <w:r>
         <w:t xml:space="preserve"> continuously calculates the temperature rate of change in C/s using a rolling-window linear regression. It prints the current temperature, rate of change, and predicted temperature after five minutes. The LED logic provides a red warning for rapid heating above +4 C/min, a yellow warning for rapid cooling below -4 C/min, and a green light when the temperature remains stable within the comfort range.</w:t>
+      </w:r>
+    </w:p>
+    <w:p>
+      <w:pPr>
+        <w:keepNext/>
+      </w:pPr>
+      <w:r>
+        <w:rPr>
+          <w:noProof/>
+        </w:rPr>
+        <w:lastRenderedPageBreak/>
+        <w:drawing>
+          <wp:inline distT="0" distB="0" distL="0" distR="0" wp14:anchorId="487E2F1C" wp14:editId="589ED0CF">
+            <wp:extent cx="5731510" cy="7764780"/>
+            <wp:effectExtent l="0" t="0" r="0" b="0"/>
+            <wp:docPr id="1561131679" name="图片 8" descr="图示&#10;&#10;AI 生成的内容可能不正确。"/>
+            <wp:cNvGraphicFramePr>
+              <a:graphicFrameLocks xmlns:a="http://schemas.openxmlformats.org/drawingml/2006/main" noChangeAspect="1"/>
+            </wp:cNvGraphicFramePr>
+            <a:graphic xmlns:a="http://schemas.openxmlformats.org/drawingml/2006/main">
+              <a:graphicData uri="http://schemas.openxmlformats.org/drawingml/2006/picture">
+                <pic:pic xmlns:pic="http://schemas.openxmlformats.org/drawingml/2006/picture">
+                  <pic:nvPicPr>
+                    <pic:cNvPr id="1561131679" name="图片 8" descr="图示&#10;&#10;AI 生成的内容可能不正确。"/>
+                    <pic:cNvPicPr/>
+                  </pic:nvPicPr>
+                  <pic:blipFill>
+                    <a:blip r:embed="rId14">
+                      <a:extLst>
+                        <a:ext uri="{28A0092B-C50C-407E-A947-70E740481C1C}">
+                          <a14:useLocalDpi xmlns:a14="http://schemas.microsoft.com/office/drawing/2010/main" val="0"/>
+                        </a:ext>
+                      </a:extLst>
+                    </a:blip>
+                    <a:stretch>
+                      <a:fillRect/>
+                    </a:stretch>
+                  </pic:blipFill>
+                  <pic:spPr>
+                    <a:xfrm>
+                      <a:off x="0" y="0"/>
+                      <a:ext cx="5731510" cy="7764780"/>
+                    </a:xfrm>
+                    <a:prstGeom prst="rect">
+                      <a:avLst/>
+                    </a:prstGeom>
+                  </pic:spPr>
+                </pic:pic>
+              </a:graphicData>
+            </a:graphic>
+          </wp:inline>
+        </w:drawing>
+      </w:r>
+    </w:p>
+    <w:p>
+      <w:pPr>
+        <w:pStyle w:val="ac"/>
+      </w:pPr>
+      <w:r>
+        <w:t xml:space="preserve">Figure </w:t>
+      </w:r>
+      <w:fldSimple w:instr=" SEQ Figure \* ARABIC ">
+        <w:r>
+          <w:rPr>
+            <w:noProof/>
+          </w:rPr>
+          <w:t>7</w:t>
+        </w:r>
+      </w:fldSimple>
+      <w:r>
+        <w:t xml:space="preserve"> Task3 Flowchart</w:t>
       </w:r>
     </w:p>
     <w:p/>
@@ -1990,6 +2038,7 @@
     </w:p>
     <w:p>
       <w:r>
+        <w:lastRenderedPageBreak/>
         <w:t xml:space="preserve">This project strengthened my understanding of connecting MATLAB code to physical hardware through an Arduino interface. A key challenge was keeping the timing of sensor readings consistent while also making the LEDs blink at the required rates. The final Task 2 function addresses this by structuring the high-temperature red LED warning so that the blink interval is 0.25 s while the loop </w:t>
       </w:r>
       <w:proofErr w:type="gramStart"/>
@@ -2025,9 +2074,8 @@
           <w:highlight w:val="cyan"/>
           <w:lang w:val="en-US" w:eastAsia="zh-CN"/>
         </w:rPr>
-        <w:t xml:space="preserve">AI Use </w:t>
-      </w:r>
-      <w:proofErr w:type="spellStart"/>
+        <w:t>AI Use Discl</w:t>
+      </w:r>
       <w:r>
         <w:rPr>
           <w:sz w:val="24"/>
@@ -2035,25 +2083,34 @@
           <w:highlight w:val="cyan"/>
           <w:lang w:val="en-US" w:eastAsia="zh-CN"/>
         </w:rPr>
-        <w:t>Disclusure</w:t>
-      </w:r>
-      <w:proofErr w:type="spellEnd"/>
+        <w:t>o</w:t>
+      </w:r>
+      <w:r>
+        <w:rPr>
+          <w:sz w:val="24"/>
+          <w:szCs w:val="24"/>
+          <w:highlight w:val="cyan"/>
+          <w:lang w:val="en-US" w:eastAsia="zh-CN"/>
+        </w:rPr>
+        <w:t>sure</w:t>
+      </w:r>
     </w:p>
     <w:p>
       <w:pPr>
         <w:jc w:val="both"/>
         <w:rPr>
+          <w:rFonts w:hint="eastAsia"/>
           <w:color w:val="000000" w:themeColor="text1"/>
           <w:highlight w:val="cyan"/>
-          <w:lang w:eastAsia="zh-CN"/>
+          <w:lang w:val="en-US" w:eastAsia="zh-CN"/>
         </w:rPr>
       </w:pPr>
     </w:p>
     <w:sectPr>
-      <w:headerReference w:type="default" r:id="rId14"/>
-      <w:footerReference w:type="default" r:id="rId15"/>
-      <w:headerReference w:type="first" r:id="rId16"/>
-      <w:footerReference w:type="first" r:id="rId17"/>
+      <w:headerReference w:type="default" r:id="rId15"/>
+      <w:footerReference w:type="default" r:id="rId16"/>
+      <w:headerReference w:type="first" r:id="rId17"/>
+      <w:footerReference w:type="first" r:id="rId18"/>
       <w:pgSz w:w="11906" w:h="16838"/>
       <w:pgMar w:top="1440" w:right="1440" w:bottom="1440" w:left="1440" w:header="850" w:footer="708" w:gutter="0"/>
       <w:cols w:space="708"/>

</xml_diff>